<commit_message>
merge docs ; class-level ethics; validation-split audit cases;.
</commit_message>
<xml_diff>
--- a/The-Interpreters-ProjectProposal-XDS-125970-126729-127419-127305-127366.docx
+++ b/The-Interpreters-ProjectProposal-XDS-125970-126729-127419-127305-127366.docx
@@ -276,7 +276,7 @@
           <w:sz w:val="20"/>
           <w:szCs w:val="20"/>
         </w:rPr>
-        <w:t xml:space="preserve">Early identification of dropout risk can enable timely academic or financial support, but an unreliable explanation can misdirect scarce advising resources or produce unjustified conclusions about a student. This project will examine first-year undergraduate dropout risk using structured data from the UCI Predict Students' Dropout and Academic Success dataset and </w:t>
+        <w:t>Early identification of dropout risk can enable timely academic or financial support, but an unreliable explanation can misdirect scarce advising resources or produce unjustified conclusions about a student. This project will examine first-year undergraduate dropout risk using structured data from the UCI Predict Students' Dropout and Academic Success dataset and TabICL, a peer-reviewed tabular foundation model (TFM) for in-context learning (Qu et al., 2025). TFMs achieve competitive results on small tabular datasets (Hollmann et al., 2025), but explanation quality is multidimensional and must be evaluated quantitatively and with users, not through anecdotal plots alone (Nauta et al., 2023). The principal contribution will therefore be evidence about the reliability and practical value of local explanations. Three questions will guide the study: RQ1: does TabICL add predictive value over simpler baselines; RQ2: are its local explanations faithful and stable; RQ3: do they help users anticipate model outputs and identify feasible support actions? Real-data model results, explanation audits and human-study findings will be reported separately, and explanations will be presented as descriptions of model associations, not as causes of dropout.</w:t>
       </w:r>
       <w:proofErr w:type="spellStart"/>
       <w:r>
@@ -285,7 +285,6 @@
           <w:sz w:val="20"/>
           <w:szCs w:val="20"/>
         </w:rPr>
-        <w:t>TabICL</w:t>
       </w:r>
       <w:proofErr w:type="spellEnd"/>
       <w:r>
@@ -294,7 +293,6 @@
           <w:sz w:val="20"/>
           <w:szCs w:val="20"/>
         </w:rPr>
-        <w:t xml:space="preserve">, a peer-reviewed tabular foundation model (TFM) for in-context learning (Qu et al., 2025). TFMs achieve competitive results on small tabular datasets (Hollmann et al., 2025), but explanation quality is multidimensional and must be evaluated quantitatively and with users, not through anecdotal plots alone (Nauta et al., 2023). The principal contribution will therefore be evidence about the reliability and practical value of local explanations. Three questions will guide the study: </w:t>
       </w:r>
       <w:r>
         <w:rPr>
@@ -304,7 +302,6 @@
           <w:sz w:val="20"/>
           <w:szCs w:val="20"/>
         </w:rPr>
-        <w:t>RQ1:</w:t>
       </w:r>
       <w:r>
         <w:rPr>
@@ -312,7 +309,6 @@
           <w:sz w:val="20"/>
           <w:szCs w:val="20"/>
         </w:rPr>
-        <w:t xml:space="preserve"> does </w:t>
       </w:r>
       <w:proofErr w:type="spellStart"/>
       <w:r>
@@ -321,7 +317,6 @@
           <w:sz w:val="20"/>
           <w:szCs w:val="20"/>
         </w:rPr>
-        <w:t>TabICL</w:t>
       </w:r>
       <w:proofErr w:type="spellEnd"/>
       <w:r>
@@ -330,7 +325,6 @@
           <w:sz w:val="20"/>
           <w:szCs w:val="20"/>
         </w:rPr>
-        <w:t xml:space="preserve"> add predictive value over simpler baselines; </w:t>
       </w:r>
       <w:r>
         <w:rPr>
@@ -340,7 +334,6 @@
           <w:sz w:val="20"/>
           <w:szCs w:val="20"/>
         </w:rPr>
-        <w:t>RQ2:</w:t>
       </w:r>
       <w:r>
         <w:rPr>
@@ -348,7 +341,6 @@
           <w:sz w:val="20"/>
           <w:szCs w:val="20"/>
         </w:rPr>
-        <w:t xml:space="preserve"> are its local explanations faithful and stable; </w:t>
       </w:r>
       <w:r>
         <w:rPr>
@@ -358,7 +350,6 @@
           <w:sz w:val="20"/>
           <w:szCs w:val="20"/>
         </w:rPr>
-        <w:t>RQ3:</w:t>
       </w:r>
       <w:r>
         <w:rPr>
@@ -366,7 +357,6 @@
           <w:sz w:val="20"/>
           <w:szCs w:val="20"/>
         </w:rPr>
-        <w:t xml:space="preserve"> do they help users anticipate model outputs and identify feasible support actions?</w:t>
       </w:r>
     </w:p>
     <w:p>
@@ -981,7 +971,7 @@
           <w:sz w:val="20"/>
           <w:szCs w:val="20"/>
         </w:rPr>
-        <w:t xml:space="preserve">As a TFM is not a tree ensemble, </w:t>
+        <w:t>As a TFM is not a tree ensemble, TreeSHAP exactness will not be claimed. Model-agnostic permutation SHAP (Lundberg &amp; Lee, 2017) will explain dropout probability using 25 training-only background rows and a max_evals budget of 67 model evaluations per explained case; 67 is the explainer budget, not a count of cases. The local faithfulness and stability audits will use the same 20 cases described in Section 5.3, selected from the validation split by predicted-risk stratum using predictions only, so neither test data nor outcome labels influence case selection or tuning. Signed member attributions will be summed within each semantic group, preserving additivity, before groups are ranked by absolute total. Deletion will mask those same groups with training references, recompute derived variables, and compare the cumulative absolute probability change with 50 random group orders; the primary statistic will be ranked-minus-random area with case-level uncertainty. Similar curves will indicate inadequate fidelity, and masking will measure model reliance, not intervention, and attributions describe model associations, not causes of dropout. Validation checks reconstructed TabICL probabilities within 4.1e-8 and recovered known white-box attribution ranks with Spearman 1.0. Grouped permutation importance will supply global reliance, while ALE will examine three validation-selected numerical effects with less off-manifold risk than PDP under correlation.</w:t>
       </w:r>
       <w:proofErr w:type="spellStart"/>
       <w:r>
@@ -990,7 +980,6 @@
           <w:sz w:val="20"/>
           <w:szCs w:val="20"/>
         </w:rPr>
-        <w:t>TreeSHAP</w:t>
       </w:r>
       <w:proofErr w:type="spellEnd"/>
       <w:r>
@@ -999,7 +988,6 @@
           <w:sz w:val="20"/>
           <w:szCs w:val="20"/>
         </w:rPr>
-        <w:t xml:space="preserve"> exactness will not be claimed. Model-agnostic permutation SHAP (Lundberg &amp; Lee, 2017) will explain dropout probability using 25 training-only background rows and a </w:t>
       </w:r>
       <w:proofErr w:type="spellStart"/>
       <w:r>
@@ -1008,7 +996,6 @@
           <w:sz w:val="20"/>
           <w:szCs w:val="20"/>
         </w:rPr>
-        <w:t>max_evals</w:t>
       </w:r>
       <w:proofErr w:type="spellEnd"/>
       <w:r>
@@ -1017,7 +1004,6 @@
           <w:sz w:val="20"/>
           <w:szCs w:val="20"/>
         </w:rPr>
-        <w:t xml:space="preserve"> budget of 67 model evaluations per explained case; 67 is the explainer budget, not a count of cases. The local faithfulness and stability audits will use the same 20 cases described in Section 5.3, selected from the held-out test set by predicted-risk stratum only after all analysis choices are frozen; test labels will not be used for case selection or tuning. Signed member attributions will be summed within each semantic group, preserving additivity, before groups are ranked by absolute total. Deletion will mask those same groups with training references, recompute derived variables, and compare the cumulative absolute probability change with 50 random group orders; the primary statistic will be ranked-minus-random area with case-level uncertainty. Similar curves will indicate inadequate fidelity, and masking will measure reliance, not intervention. Validation checks reconstructed </w:t>
       </w:r>
       <w:proofErr w:type="spellStart"/>
       <w:r>
@@ -1026,7 +1012,6 @@
           <w:sz w:val="20"/>
           <w:szCs w:val="20"/>
         </w:rPr>
-        <w:t>TabICL</w:t>
       </w:r>
       <w:proofErr w:type="spellEnd"/>
       <w:r>
@@ -1035,7 +1020,6 @@
           <w:sz w:val="20"/>
           <w:szCs w:val="20"/>
         </w:rPr>
-        <w:t xml:space="preserve"> probabilities within 4.1e-8 and recovered known white-box attribution ranks with Spearman 1.0. Grouped permutation importance will supply global reliance, while ALE will examine three validation-selected numerical effects with less off-manifold risk than PDP under correlation.</w:t>
       </w:r>
     </w:p>
     <w:p>
@@ -1083,7 +1067,7 @@
           <w:sz w:val="20"/>
           <w:szCs w:val="20"/>
         </w:rPr>
-        <w:t>The stability and local faithfulness evaluations will use the same 20 held-out test cases, selected after all model and explanation choices are frozen by taking four cases from each of five predicted-risk strata; selection uses predictions only and never outcome labels. For each case, the explainer will run 10 times, varying seed and training-background sample separately. Mean pairwise top-five overlap—shared features divided by five—will be primary, with rank correlation secondary. Continuous perturbations will draw Gaussian noise with standard deviation equal to 1% of the feature's training standard deviation, clip to training bounds, recompute dependencies, and qualify only when absolute probability change is at most 0.01. Mean overlap below the validation-frozen 0.80 warning level will be displayed, not hidden through selective reruns (</w:t>
+        <w:t>The stability and local faithfulness evaluations will use the same 20 validation cases, selected deterministically by taking four cases from each of five predicted-risk strata; selection uses predictions only and never outcome labels, and the test split stays unopened. For each case, the explainer will run 10 times, varying seed and training-background sample separately. Mean pairwise top-five overlap—shared features divided by five—will be primary, with rank correlation secondary. Continuous perturbations will draw Gaussian noise with standard deviation equal to 1% of the feature's training standard deviation, clip to training bounds, recompute dependencies, and qualify only when absolute probability change is at most 0.01. Mean overlap below the validation-frozen 0.80 warning level will be displayed, not hidden through selective reruns (Tiukhova et al., 2024).</w:t>
       </w:r>
       <w:proofErr w:type="spellStart"/>
       <w:r>
@@ -1092,7 +1076,6 @@
           <w:sz w:val="20"/>
           <w:szCs w:val="20"/>
         </w:rPr>
-        <w:t>Tiukhova</w:t>
       </w:r>
       <w:proofErr w:type="spellEnd"/>
       <w:r>
@@ -1101,7 +1084,6 @@
           <w:sz w:val="20"/>
           <w:szCs w:val="20"/>
         </w:rPr>
-        <w:t xml:space="preserve"> et al., 2024).</w:t>
       </w:r>
     </w:p>
     <w:p>
@@ -1149,7 +1131,7 @@
           <w:sz w:val="20"/>
           <w:szCs w:val="20"/>
         </w:rPr>
-        <w:t xml:space="preserve">Following forward-simulation evaluation (Hase &amp; Bansal, 2020), the human study will aim to recruit 8–10 voluntary AIT participants. At least four participants will be required, and the achieved sample will be allocated as evenly as practicable between groups using seeded assignment. After </w:t>
+        <w:t>Following forward-simulation evaluation (Hase &amp; Bansal, 2020), the human study will aim to recruit 8–10 voluntary AIT participants. At least four participants will be required, and the achieved sample will be allocated as evenly as practicable between groups using seeded assignment. After standardised instructions and one unscored practice case, both groups will receive the same label-free panel of five flagged and five unflagged profiles in random order; the explanation group will additionally see feature contributions. Neither group will receive the output, probability, capacity boundary or correctness feedback until all 10 responses are locked. The interface will record predictions, confidence, time and written responses. Participant-level accuracy will be primary; group accuracy and time will be compared descriptively alongside illustrative paraphrased comments and coded responses (Section 5.7). Recruitment shortfalls and unequal group sizes will be reported transparently. Unless support professionals participate, the study will test proxy-user comprehensibility, not professional effectiveness, and will make no significance claim. Optional extension: if at least 12 participants are recruited, the explanation group will be split into a contribution chart only and a chart plus a plain-language narrative rendered by a verified local template from the same contributions, with no free-form generated text; with fewer participants this condition is omitted. Any such comparison is exploratory and reported separately from the model results.</w:t>
       </w:r>
       <w:proofErr w:type="spellStart"/>
       <w:r>
@@ -1158,7 +1140,6 @@
           <w:sz w:val="20"/>
           <w:szCs w:val="20"/>
         </w:rPr>
-        <w:t>standardised</w:t>
       </w:r>
       <w:proofErr w:type="spellEnd"/>
       <w:r>
@@ -1167,18 +1148,14 @@
           <w:sz w:val="20"/>
           <w:szCs w:val="20"/>
         </w:rPr>
-        <w:t xml:space="preserve"> instructions and one unscored practice case, both groups will receive the same label-free panel of five flagged and five unflagged profiles in random order; the explanation group will additionally see feature contributions. Neither group will receive the output, probability, capacity boundary or correctness feedback until all 10 responses are locked. The interface will record predictions, confidence, time and written responses.</w:t>
-      </w:r>
-      <w:r>
-        <w:t xml:space="preserve"> </w:t>
-      </w:r>
+      </w:r>
+      <w:r/>
       <w:r>
         <w:rPr>
           <w:rFonts w:ascii="Times New Roman" w:eastAsia="Times New Roman" w:hAnsi="Times New Roman"/>
           <w:sz w:val="20"/>
           <w:szCs w:val="20"/>
         </w:rPr>
-        <w:t>With participants’ consent, the researcher will also make brief notes on two or three think-aloud comments made during the task.</w:t>
       </w:r>
       <w:r>
         <w:rPr>
@@ -1186,7 +1163,6 @@
           <w:sz w:val="20"/>
           <w:szCs w:val="20"/>
         </w:rPr>
-        <w:t xml:space="preserve"> Participant-level accuracy will be primary; group accuracy and time will be compared descriptively alongside illustrative paraphrased comments and coded responses (Section 5.7). Recruitment shortfalls and unequal group sizes will be reported transparently. Unless support professionals participate, the study will test proxy-user comprehensibility, not professional effectiveness, and will make no significance claim.</w:t>
       </w:r>
     </w:p>
     <w:p>
@@ -1310,7 +1286,7 @@
           <w:sz w:val="20"/>
           <w:szCs w:val="20"/>
         </w:rPr>
-        <w:t xml:space="preserve">The end-to-end workflow will deliver a frozen comparison of </w:t>
+        <w:t>The end-to-end workflow will deliver a frozen comparison of TabICL and baselines, explanation and recourse evidence, subgroup diagnostics, human-study findings, a model card and reproducible reports. A lightweight browser-based research interface will provide decision support with frozen predictions, local explanations, reliability warnings and feasible support options, plus a blinded-study mode. The blinded study will withhold model outputs and feedback until all 10 scored responses are submitted. The interface will render versioned, precomputed Python outputs (predictions, contributions and reliability warnings) rather than run live inference, run locally or in a controlled course environment, and accept only pre-approved, pseudonymised UCI test cases. Case packs and response submissions will be validated, rejecting missing, extra, invalid or out-of-range fields rather than silently changing them. Model weights, raw participant responses and credentials will never enter frontend code or version control, and an audit panel will display model, data-split and interface versions for traceability. Before test access, interface parity is checked with training/validation fixtures; study cases are loaded only after the single final evaluation, followed by an export-parity check without retuning. It is a research demonstration, not a production AIT service.</w:t>
       </w:r>
       <w:proofErr w:type="spellStart"/>
       <w:r>
@@ -1319,7 +1295,6 @@
           <w:sz w:val="20"/>
           <w:szCs w:val="20"/>
         </w:rPr>
-        <w:t>TabICL</w:t>
       </w:r>
       <w:proofErr w:type="spellEnd"/>
       <w:r>
@@ -1328,7 +1303,6 @@
           <w:sz w:val="20"/>
           <w:szCs w:val="20"/>
         </w:rPr>
-        <w:t xml:space="preserve"> and baselines, explanation and recourse evidence, subgroup diagnostics, human-study findings, a model card and reproducible reports. A lightweight browser-based research interface will provide decision support with frozen predictions, local explanations, reliability warnings and feasible support options, plus a blinded-study mode. The blinded study will withhold model outputs and feedback until all 10 scored responses are submitted. The interface will load the evaluation's versioned preprocessing and model artefacts, run locally or in a controlled course environment, accept only pre-approved, </w:t>
       </w:r>
       <w:proofErr w:type="spellStart"/>
       <w:r>
@@ -1337,7 +1311,6 @@
           <w:sz w:val="20"/>
           <w:szCs w:val="20"/>
         </w:rPr>
-        <w:t>pseudonymised</w:t>
       </w:r>
       <w:proofErr w:type="spellEnd"/>
       <w:r>
@@ -1346,7 +1319,6 @@
           <w:sz w:val="20"/>
           <w:szCs w:val="20"/>
         </w:rPr>
-        <w:t xml:space="preserve"> UCI test cases, reject missing, extra, invalid or out-of-range fields rather than silently changing them, and display model, data-split and interface versions in an audit panel for traceability. It is a research demonstration, not a production AIT service.</w:t>
       </w:r>
     </w:p>
     <w:p>
@@ -1797,7 +1769,7 @@
                 <w:szCs w:val="14"/>
               </w:rPr>
               <w:br/>
-              <w:t>preselected held-out cases</w:t>
+              <w:t>audit + study cases</w:t>
             </w:r>
             <w:r>
               <w:rPr>
@@ -2433,7 +2405,7 @@
           <w:sz w:val="20"/>
           <w:szCs w:val="20"/>
         </w:rPr>
-        <w:t xml:space="preserve">The UCI dataset is publicly available under CC BY 4.0 with no direct identifiers; its citation and </w:t>
+        <w:t>The UCI dataset is publicly available under CC BY 4.0 with no direct identifiers; its citation and licence will be preserved, the raw file will remain unchanged, and all transformations will be documented. Human-study participants will be consenting adults (18 or older) recruited voluntarily from the AIT community; participation or refusal will have no effect on grades, employment or access to services. Consent information will explain the task, recorded data, withdrawal limit and retention plan before participation. No names or institutional identifiers will be collected in study responses; random participant IDs and pseudonymised case IDs will be used, and any case lookup will be stored separately with access limited to the research team. Raw free text will stay outside version control and accidental identifiers will be removed; pseudonymous does not mean fully anonymous, so raw-response access will be restricted to the research team. Participants may request withdrawal using their participant ID until their response has been de-identified and included in aggregate analysis; this limit will be stated during consent. As a class project, the study follows basic research-ethics practice (voluntary informed consent, minimal data, no identifiers, restricted access and a stated retention limit) rather than a formal institutional ethics-board process, and collection will stay within the consent text shown to participants. Before recruitment, the team will also record the applicable course retention deadline; raw responses and case-linkage files will be securely deleted at that deadline, retaining only non-identifiable aggregate results. The interface will run locally or in a controlled course environment. Public deployment is outside the scope of this project and would require separate privacy, security and ethics review.</w:t>
       </w:r>
       <w:proofErr w:type="spellStart"/>
       <w:r>
@@ -2442,7 +2414,6 @@
           <w:sz w:val="20"/>
           <w:szCs w:val="20"/>
         </w:rPr>
-        <w:t>licence</w:t>
       </w:r>
       <w:proofErr w:type="spellEnd"/>
       <w:r>
@@ -2451,7 +2422,6 @@
           <w:sz w:val="20"/>
           <w:szCs w:val="20"/>
         </w:rPr>
-        <w:t xml:space="preserve"> will be preserved, the raw file will remain unchanged, and all transformations will be documented. Human-study participants will be consenting adults (18 or older) recruited voluntarily from the AIT community; participation or refusal will have no effect on grades, employment or access to services. Consent information will explain the task, recorded data, withdrawal limit and retention plan before participation. No names or institutional identifiers will be collected in study responses; random participant IDs and </w:t>
       </w:r>
       <w:proofErr w:type="spellStart"/>
       <w:r>
@@ -2460,7 +2430,6 @@
           <w:sz w:val="20"/>
           <w:szCs w:val="20"/>
         </w:rPr>
-        <w:t>pseudonymised</w:t>
       </w:r>
       <w:proofErr w:type="spellEnd"/>
       <w:r>
@@ -2469,7 +2438,6 @@
           <w:sz w:val="20"/>
           <w:szCs w:val="20"/>
         </w:rPr>
-        <w:t xml:space="preserve"> case IDs will be used, and any case lookup will be stored separately with access limited to the research team. Raw free text will stay outside version control and accidental identifiers will be removed. Participants may request withdrawal using their participant ID until their response has been de-identified and included in aggregate analysis; this limit will be stated during consent. Before recruitment, the team will confirm with the course instructor whether institutional review or a formal determination is required, and will not recruit until any required approval is obtained. Before recruitment, the team will also record the applicable course/institutional retention deadline; raw responses and case-linkage files will be securely deleted at that deadline, retaining only non-identifiable aggregate results. The interface will run locally or in a controlled course environment. Public deployment is outside the scope of this project and would require separate privacy, security and ethics review.</w:t>
       </w:r>
     </w:p>
     <w:p>
@@ -2522,7 +2490,7 @@
           <w:sz w:val="20"/>
           <w:szCs w:val="20"/>
         </w:rPr>
-        <w:t xml:space="preserve">Plausible proxies will also be examined: parental occupation and qualification may encode socio-economic position, course and application mode may reflect demographic sorting, and debtor, tuition-fee and scholarship variables may encode financial disadvantage. Removing a protected attribute does not eliminate correlated proxy information, so influential proxies and limitations will be documented even where they weaken the model's apparent suitability. The system will support outreach </w:t>
+        <w:t>Plausible proxies will also be examined: parental occupation and qualification may encode socio-economic position, course and application mode may reflect demographic sorting, and debtor, tuition-fee and scholarship variables may encode financial disadvantage. Removing a protected attribute does not eliminate correlated proxy information, so influential proxies and limitations will be documented even where they weaken the model's apparent suitability. The system will support outreach prioritisation, not autonomous denial of education or services, and it must not frame financial disadvantage as a personal obligation.</w:t>
       </w:r>
       <w:proofErr w:type="spellStart"/>
       <w:r>
@@ -2531,7 +2499,6 @@
           <w:sz w:val="20"/>
           <w:szCs w:val="20"/>
         </w:rPr>
-        <w:t>prioritisation</w:t>
       </w:r>
       <w:proofErr w:type="spellEnd"/>
       <w:r>
@@ -2540,7 +2507,6 @@
           <w:sz w:val="20"/>
           <w:szCs w:val="20"/>
         </w:rPr>
-        <w:t>, not autonomous denial of education or services.</w:t>
       </w:r>
     </w:p>
     <w:p>
@@ -2587,7 +2553,7 @@
           <w:sz w:val="20"/>
           <w:szCs w:val="20"/>
         </w:rPr>
-        <w:t xml:space="preserve"> combines learned representations with in-context information from a reference set and fails simulatability and decomposability: its reasoning cannot be recovered from a coefficient list or small tree, motivating Section 5.2's post-hoc protocol. By contrast, the main-effects EBM is intrinsically interpretable: each prediction is exactly the logistic transform of an intercept plus one learned shape-function contribution per feature. Its validation probabilities reconstruct from those terms within 3.4e-16, and global term strengths plus fixed low-, median- and high-risk local decompositions are exported. Logistic regression and the depth-3 tree provide further </w:t>
+        <w:t xml:space="preserve"> combines learned representations with in-context information from a reference set and fails simulatability and decomposability: its reasoning cannot be recovered from a coefficient list or small tree, motivating Section 5.2's post-hoc protocol. By contrast, the main-effects EBM is intrinsically interpretable: each prediction is exactly the logistic transform of an intercept plus one learned shape-function contribution per feature. Its validation probabilities reconstruct from those terms within 3.3e-16, and global term strengths plus fixed low-, median- and high-risk local decompositions are exported. Logistic regression and the depth-3 tree provide further </w:t>
       </w:r>
       <w:proofErr w:type="spellStart"/>
       <w:r>
@@ -2678,7 +2644,7 @@
           <w:sz w:val="20"/>
           <w:szCs w:val="20"/>
         </w:rPr>
-        <w:t xml:space="preserve">The repository separates source data, EDA, modelling, explanation evaluation, study materials and outputs. A pinned environment supports a fresh clone. Seed 42 and source-row IDs define the split; protocol 1.2, 26 in-scope tests, four baselines, capacity-consistent recourse, exact EBM decomposition, </w:t>
+        <w:t xml:space="preserve">The repository separates source data, EDA, modelling, explanation evaluation, study materials and outputs. A pinned environment supports a fresh clone. Seed 42 and source-row IDs define the split; protocol 1.3, 26 in-scope tests, four baselines, capacity-consistent recourse, exact EBM decomposition, </w:t>
       </w:r>
       <w:proofErr w:type="spellStart"/>
       <w:r>
@@ -2733,7 +2699,7 @@
           <w:sz w:val="20"/>
           <w:szCs w:val="20"/>
         </w:rPr>
-        <w:t xml:space="preserve">The proposed contribution will extend beyond accuracy by asking whether </w:t>
+        <w:t>The proposed contribution will extend beyond accuracy by asking whether TabICL's post-hoc local explanations merit trust and whether an intrinsically interpretable EBM offers a more defensible alternative. Same-test-set baselines, deletion faithfulness, white-box recovery, repeated-run and perturbation stability, human forward simulation, qualitative evidence and feasibility-constrained counterfactuals will form a coherent evaluation. Expected limitations include the single-institution UCI context, exclusion of unresolved Enrolled outcomes, approximate model-agnostic attribution, non-causal observational data, a small convenience sample, and likely non-professional audience proxies; therefore, the AIT study will test comprehensibility, not predictive validity or deployment suitability at AIT. If recruitment reaches only the minimum sample, the study will remain descriptive. Findings will remain valuable if EBM matches or exceeds TabICL, explanations are unstable or unfaithful, participants gain no benefit, or feasible recourse is unavailable. Explanations describe model associations, not causal diagnoses or guaranteed intervention benefits, and real-data predictive evidence, explanation audits and human-study findings will not be merged into a single claim.</w:t>
       </w:r>
       <w:proofErr w:type="spellStart"/>
       <w:r>
@@ -2742,7 +2708,6 @@
           <w:sz w:val="20"/>
           <w:szCs w:val="20"/>
         </w:rPr>
-        <w:t>TabICL's</w:t>
       </w:r>
       <w:proofErr w:type="spellEnd"/>
       <w:r>
@@ -2751,7 +2716,6 @@
           <w:sz w:val="20"/>
           <w:szCs w:val="20"/>
         </w:rPr>
-        <w:t xml:space="preserve"> post-hoc local explanations merit trust and whether an intrinsically interpretable EBM offers a more defensible alternative. Same-test-set baselines, deletion faithfulness, white-box recovery, repeated-run and perturbation stability, human forward simulation, qualitative evidence and feasibility-constrained counterfactuals will form a coherent evaluation. Expected limitations include the single-institution UCI context, exclusion of unresolved Enrolled outcomes, approximate model-agnostic attribution, non-causal observational data, a small convenience sample, and likely non-professional audience proxies; therefore, the AIT study will test comprehensibility, not predictive validity or deployment suitability at AIT. If recruitment reaches only the minimum sample, the study will remain descriptive. Findings will remain valuable if EBM matches or exceeds </w:t>
       </w:r>
       <w:proofErr w:type="spellStart"/>
       <w:r>
@@ -2760,7 +2724,6 @@
           <w:sz w:val="20"/>
           <w:szCs w:val="20"/>
         </w:rPr>
-        <w:t>TabICL</w:t>
       </w:r>
       <w:proofErr w:type="spellEnd"/>
       <w:r>
@@ -2769,7 +2732,6 @@
           <w:sz w:val="20"/>
           <w:szCs w:val="20"/>
         </w:rPr>
-        <w:t>, explanations are unstable or unfaithful, participants gain no benefit, or feasible recourse is unavailable.</w:t>
       </w:r>
     </w:p>
     <w:p>
@@ -2859,6 +2821,7 @@
     </w:p>
     <w:p>
       <w:pPr>
+        <w:pageBreakBefore/>
         <w:jc w:val="both"/>
         <w:rPr>
           <w:rFonts w:ascii="Times New Roman" w:hAnsi="Times New Roman" w:cs="Times New Roman"/>

</xml_diff>